<commit_message>
Updated the Threat Prioritization - Candidate Risking Procedure tertiary document (corrected wording in 14791 definitions)
</commit_message>
<xml_diff>
--- a/source/reference_documents/tertiary_documents/foundation/threat prioritization/candidate risking/Threat Prioritization - Candidate Risking.docx
+++ b/source/reference_documents/tertiary_documents/foundation/threat prioritization/candidate risking/Threat Prioritization - Candidate Risking.docx
@@ -46,7 +46,7 @@
         <w:t xml:space="preserve">Version </w:t>
       </w:r>
       <w:r>
-        <w:t>2</w:t>
+        <w:t>3</w:t>
       </w:r>
     </w:p>
     <w:p>
@@ -63,7 +63,7 @@
         <w:rPr>
           <w:noProof/>
         </w:rPr>
-        <w:t>8/24/26 1:55 PM</w:t>
+        <w:t>8/26/26 12:25 PM</w:t>
       </w:r>
       <w:r>
         <w:fldChar w:fldCharType="end"/>
@@ -1841,9 +1841,9 @@
           <w:noProof/>
         </w:rPr>
         <w:drawing>
-          <wp:inline distT="0" distB="0" distL="0" distR="0" wp14:anchorId="70948F08" wp14:editId="34AC976C">
-            <wp:extent cx="5931818" cy="2127564"/>
-            <wp:effectExtent l="0" t="0" r="0" b="6350"/>
+          <wp:inline distT="0" distB="0" distL="0" distR="0" wp14:anchorId="70948F08" wp14:editId="728E33A3">
+            <wp:extent cx="5982214" cy="2145639"/>
+            <wp:effectExtent l="0" t="0" r="0" b="1270"/>
             <wp:docPr id="351645259" name="Picture 2"/>
             <wp:cNvGraphicFramePr>
               <a:graphicFrameLocks xmlns:a="http://schemas.openxmlformats.org/drawingml/2006/main" noChangeAspect="1"/>
@@ -1864,7 +1864,7 @@
                   <pic:spPr>
                     <a:xfrm>
                       <a:off x="0" y="0"/>
-                      <a:ext cx="5982214" cy="2145640"/>
+                      <a:ext cx="5982214" cy="2145639"/>
                     </a:xfrm>
                     <a:prstGeom prst="rect">
                       <a:avLst/>

</xml_diff>

<commit_message>
Updated the Threat Prioritization - Candidate Risking Procedure tertiary document (corrected wording in 800-30 definitions)
</commit_message>
<xml_diff>
--- a/source/reference_documents/tertiary_documents/foundation/threat prioritization/candidate risking/Threat Prioritization - Candidate Risking.docx
+++ b/source/reference_documents/tertiary_documents/foundation/threat prioritization/candidate risking/Threat Prioritization - Candidate Risking.docx
@@ -46,7 +46,7 @@
         <w:t xml:space="preserve">Version </w:t>
       </w:r>
       <w:r>
-        <w:t>3</w:t>
+        <w:t>4</w:t>
       </w:r>
     </w:p>
     <w:p>
@@ -63,7 +63,7 @@
         <w:rPr>
           <w:noProof/>
         </w:rPr>
-        <w:t>8/26/26 12:25 PM</w:t>
+        <w:t>8/26/26 1:09 PM</w:t>
       </w:r>
       <w:r>
         <w:fldChar w:fldCharType="end"/>
@@ -1310,13 +1310,7 @@
         <w:t>3.4.4. Risk</w:t>
       </w:r>
       <w:r>
-        <w:t>, there are multiple risk domains which may need to be taken into consideration when evaluating cybersecurity-based threats</w:t>
-      </w:r>
-      <w:r>
-        <w:t>.</w:t>
-      </w:r>
-      <w:r>
-        <w:t xml:space="preserve"> When this is the case, it is assumed that each risk domain provides a separate treatment of the ranked threat candidates.</w:t>
+        <w:t>, there are multiple risk domains which may need to be taken into consideration when evaluating cybersecurity-based threats. When this is the case, it is assumed that each risk domain provides a separate treatment of the ranked threat candidates.</w:t>
       </w:r>
     </w:p>
     <w:p>
@@ -1335,10 +1329,7 @@
         <w:tab/>
       </w:r>
       <w:r>
-        <w:t xml:space="preserve">The </w:t>
-      </w:r>
-      <w:r>
-        <w:t>results of multiple risk domain consideration will be addressed in the risk domain consolidation activity of the threat prioritization process</w:t>
+        <w:t>The results of multiple risk domain consideration will be addressed in the risk domain consolidation activity of the threat prioritization process</w:t>
       </w:r>
       <w:r>
         <w:t>.</w:t>
@@ -1791,45 +1782,27 @@
         <w:pStyle w:val="Heading2"/>
       </w:pPr>
       <w:r>
-        <w:t>Impact (</w:t>
-      </w:r>
-      <w:r>
+        <w:t>Impact (ISO 14971 Rubric)</w:t>
+      </w:r>
+    </w:p>
+    <w:p>
+      <w:r>
+        <w:t xml:space="preserve">The focus of </w:t>
+      </w:r>
+      <w:r>
+        <w:rPr>
+          <w:b/>
+          <w:bCs/>
+        </w:rPr>
         <w:t>ISO 14971</w:t>
       </w:r>
       <w:r>
-        <w:t xml:space="preserve"> Rubric)</w:t>
-      </w:r>
-    </w:p>
-    <w:p>
-      <w:r>
-        <w:t xml:space="preserve">The focus of </w:t>
-      </w:r>
-      <w:r>
-        <w:rPr>
-          <w:b/>
-          <w:bCs/>
-        </w:rPr>
-        <w:t>ISO 14971</w:t>
-      </w:r>
-      <w:r>
-        <w:t xml:space="preserve"> is </w:t>
-      </w:r>
-      <w:r>
-        <w:t>medical device risk management</w:t>
-      </w:r>
-      <w:r>
-        <w:t>.</w:t>
-      </w:r>
-    </w:p>
-    <w:p>
-      <w:r>
-        <w:t xml:space="preserve">The following table shows how </w:t>
-      </w:r>
-      <w:r>
-        <w:t>ISO 14971</w:t>
-      </w:r>
-      <w:r>
-        <w:t xml:space="preserve"> defines its impact values. </w:t>
+        <w:t xml:space="preserve"> is medical device risk management.</w:t>
+      </w:r>
+    </w:p>
+    <w:p>
+      <w:r>
+        <w:t xml:space="preserve">The following table shows how ISO 14971 defines its impact values. </w:t>
       </w:r>
     </w:p>
     <w:p>
@@ -2019,16 +1992,7 @@
         <w:t>NIST SP 800-30</w:t>
       </w:r>
       <w:r>
-        <w:t xml:space="preserve"> is </w:t>
-      </w:r>
-      <w:r>
-        <w:t>general</w:t>
-      </w:r>
-      <w:r>
-        <w:t xml:space="preserve"> cybersecurity.</w:t>
-      </w:r>
-      <w:r>
-        <w:t xml:space="preserve"> It can be applied within any risk domain.</w:t>
+        <w:t xml:space="preserve"> is general cybersecurity. It can be applied within any risk domain.</w:t>
       </w:r>
     </w:p>
     <w:p>
@@ -2211,13 +2175,7 @@
     </w:p>
     <w:p>
       <w:r>
-        <w:t xml:space="preserve">The following table shows how </w:t>
-      </w:r>
-      <w:r>
-        <w:t>SP 800-30</w:t>
-      </w:r>
-      <w:r>
-        <w:t xml:space="preserve"> defines its impact values. </w:t>
+        <w:t xml:space="preserve">The following table shows how SP 800-30 defines its impact values. </w:t>
       </w:r>
     </w:p>
     <w:p>
@@ -2229,9 +2187,9 @@
           <w:noProof/>
         </w:rPr>
         <w:drawing>
-          <wp:inline distT="0" distB="0" distL="0" distR="0" wp14:anchorId="6BDCC29C" wp14:editId="5E28A06E">
-            <wp:extent cx="3885535" cy="1949222"/>
-            <wp:effectExtent l="0" t="0" r="1270" b="0"/>
+          <wp:inline distT="0" distB="0" distL="0" distR="0" wp14:anchorId="6BDCC29C" wp14:editId="6B936D08">
+            <wp:extent cx="3879144" cy="1949222"/>
+            <wp:effectExtent l="0" t="0" r="0" b="0"/>
             <wp:docPr id="1186768944" name="Picture 2"/>
             <wp:cNvGraphicFramePr>
               <a:graphicFrameLocks xmlns:a="http://schemas.openxmlformats.org/drawingml/2006/main" noChangeAspect="1"/>
@@ -2252,7 +2210,7 @@
                   <pic:spPr>
                     <a:xfrm>
                       <a:off x="0" y="0"/>
-                      <a:ext cx="3885535" cy="1949222"/>
+                      <a:ext cx="3879144" cy="1949222"/>
                     </a:xfrm>
                     <a:prstGeom prst="rect">
                       <a:avLst/>
@@ -2282,10 +2240,7 @@
       <w:bookmarkEnd w:id="5"/>
       <w:r>
         <w:lastRenderedPageBreak/>
-        <w:t>Impact Rubric</w:t>
-      </w:r>
-      <w:r>
-        <w:t xml:space="preserve"> Comparison</w:t>
+        <w:t>Impact Rubric Comparison</w:t>
       </w:r>
     </w:p>
     <w:p>
@@ -2382,21 +2337,12 @@
         <w:tab/>
       </w:r>
       <w:r>
-        <w:t>As was the case for the candidate ranking activity, a value of none has been added to aid automation</w:t>
-      </w:r>
-      <w:r>
-        <w:t>.</w:t>
-      </w:r>
-    </w:p>
-    <w:p>
-      <w:r>
-        <w:t>When using domain mapping where the impact rubric does not have the same granularity, it may be necessary to identify the appropriate mapping based on additional information provided by the rubric itself</w:t>
-      </w:r>
-      <w:r>
-        <w:t>.</w:t>
-      </w:r>
-      <w:r>
-        <w:t xml:space="preserve"> For example, although ISO 26262’s impact value of </w:t>
+        <w:t>As was the case for the candidate ranking activity, a value of none has been added to aid automation.</w:t>
+      </w:r>
+    </w:p>
+    <w:p>
+      <w:r>
+        <w:t xml:space="preserve">When using domain mapping where the impact rubric does not have the same granularity, it may be necessary to identify the appropriate mapping based on additional information provided by the rubric itself. For example, although ISO 26262’s impact value of </w:t>
       </w:r>
       <w:r>
         <w:rPr>
@@ -3802,22 +3748,7 @@
         <w:t xml:space="preserve">This is </w:t>
       </w:r>
       <w:r>
-        <w:t xml:space="preserve">domain-mapped </w:t>
-      </w:r>
-      <w:r>
-        <w:t xml:space="preserve">value </w:t>
-      </w:r>
-      <w:r>
-        <w:t>of</w:t>
-      </w:r>
-      <w:r>
-        <w:t xml:space="preserve"> the likelihood </w:t>
-      </w:r>
-      <w:r>
-        <w:t>value</w:t>
-      </w:r>
-      <w:r>
-        <w:t>. The values is selected from a dropdown list.</w:t>
+        <w:t>domain-mapped value of the likelihood value. The values is selected from a dropdown list.</w:t>
       </w:r>
     </w:p>
     <w:p>
@@ -4046,14 +3977,7 @@
           <w:b/>
           <w:bCs/>
         </w:rPr>
-        <w:t>rubric</w:t>
-      </w:r>
-      <w:r>
-        <w:rPr>
-          <w:b/>
-          <w:bCs/>
-        </w:rPr>
-        <w:t xml:space="preserve"> value</w:t>
+        <w:t>rubric value</w:t>
       </w:r>
       <w:r>
         <w:t xml:space="preserve"> field dropdown on the </w:t>
@@ -7440,6 +7364,7 @@
   <w:style w:type="character" w:default="1" w:styleId="DefaultParagraphFont">
     <w:name w:val="Default Paragraph Font"/>
     <w:uiPriority w:val="1"/>
+    <w:semiHidden/>
     <w:unhideWhenUsed/>
   </w:style>
   <w:style w:type="table" w:default="1" w:styleId="TableNormal">

</xml_diff>